<commit_message>
More details on search fixes
</commit_message>
<xml_diff>
--- a/public/assets/aylward-nickolas-resume.docx
+++ b/public/assets/aylward-nickolas-resume.docx
@@ -93,7 +93,7 @@
         <w:t xml:space="preserve">Familiarity: </w:t>
       </w:r>
       <w:r>
-        <w:t xml:space="preserve">Python, JavaScript, Jinja, Liquid, LaTeX, Harness, Mintlify, VS Code, Claude Code, Claude Desktop, Cursor, Antigravity, Postman, Bitbucket, DataTables, Google Search Console, Figma, InDesign, Photoshop, Lightroom, Dreamweaver, InVision</w:t>
+        <w:t xml:space="preserve">Python, JavaScript, Jinja, Liquid, LaTeX, Harness, Mintlify, VS Code, Claude Code, Claude Desktop, Cursor, Antigravity, Postman, Bitbucket, DataTables, Google Search Console, Figma, InDesign, Photoshop, Lightroom, Dreamweaver, Algolia</w:t>
       </w:r>
     </w:p>
     <w:p>
@@ -232,7 +232,33 @@
         <w:spacing w:after="60"/>
       </w:pPr>
       <w:r>
-        <w:t xml:space="preserve">Identified and fixed major Algolia search-indexing bugs on the documentation site, including content truncation and improper HTML/table exclusion.</w:t>
+        <w:t xml:space="preserve">Rebuilt the documentation site's Algolia search-indexing pipeline to extract visible page text instead of raw HTML and to split oversized sections into additional records instead of truncating them at Algolia's size limits, shipping the fix end-to-end across the Python index builders, CLI, and React search UI with new regression tests.</w:t>
+      </w:r>
+    </w:p>
+    <w:p>
+      <w:pPr>
+        <w:pStyle w:val="ListParagraph"/>
+        <w:numPr>
+          <w:ilvl w:val="0"/>
+          <w:numId w:val="1"/>
+        </w:numPr>
+        <w:spacing w:after="60"/>
+      </w:pPr>
+      <w:r>
+        <w:t xml:space="preserve">Redesigned the search taxonomy's facet detection to track a major documentation restructuring across NextGen, Developer, REST API, Python client, Reference, Agentic AI, and Workload API docs, and closed indexing gaps that had been dropping tabbed UI content and duplicating LLM sidecar files out of search results.</w:t>
+      </w:r>
+    </w:p>
+    <w:p>
+      <w:pPr>
+        <w:pStyle w:val="ListParagraph"/>
+        <w:numPr>
+          <w:ilvl w:val="0"/>
+          <w:numId w:val="1"/>
+        </w:numPr>
+        <w:spacing w:after="60"/>
+      </w:pPr>
+      <w:r>
+        <w:t xml:space="preserve">Cut search-QA cycle time by adding a lightweight way to run the search UI against live Algolia indexes with a read-only key, so filter and ranking changes could be verified without a full documentation rebuild.</w:t>
       </w:r>
     </w:p>
     <w:p>

</xml_diff>

<commit_message>
Expand anemic bullet point
</commit_message>
<xml_diff>
--- a/public/assets/aylward-nickolas-resume.docx
+++ b/public/assets/aylward-nickolas-resume.docx
@@ -251,20 +251,20 @@
         <w:spacing w:after="60"/>
       </w:pPr>
       <w:r>
-        <w:t xml:space="preserve">Prototyped an internal automation that drafts release notes directly from pull requests.</w:t>
-      </w:r>
-    </w:p>
-    <w:p>
-      <w:pPr>
-        <w:pStyle w:val="ListParagraph"/>
-        <w:numPr>
-          <w:ilvl w:val="0"/>
-          <w:numId w:val="1"/>
-        </w:numPr>
-        <w:spacing w:after="60"/>
-      </w:pPr>
-      <w:r>
         <w:t xml:space="preserve">Rebuilt the documentation site's Algolia search-indexing pipeline to extract visible page text instead of raw HTML and to split oversized sections into additional records instead of truncating them at Algolia's size limits, shipping the fix end-to-end across the Python index builders, CLI, and React search UI with new regression tests.</w:t>
+      </w:r>
+    </w:p>
+    <w:p>
+      <w:pPr>
+        <w:pStyle w:val="ListParagraph"/>
+        <w:numPr>
+          <w:ilvl w:val="0"/>
+          <w:numId w:val="1"/>
+        </w:numPr>
+        <w:spacing w:after="60"/>
+      </w:pPr>
+      <w:r>
+        <w:t xml:space="preserve">Prototyped a GitHub PR comment workflow to draft release notes from PR context using a lightweight LLM via DataRobot’s LLM Gateway and a style-guide skill with examples.</w:t>
       </w:r>
     </w:p>
     <w:p>

</xml_diff>